<commit_message>
Sync public subset from course_master (d3c2a40)
</commit_message>
<xml_diff>
--- a/1_Guide/templates/Decisions_TEMPLATE.docx
+++ b/1_Guide/templates/Decisions_TEMPLATE.docx
@@ -128,13 +128,13 @@
           <w:b/>
           <w:bCs/>
         </w:rPr>
-        <w:t xml:space="preserve">Audience:</w:t>
-      </w:r>
-      <w:r>
-        <w:t xml:space="preserve"> </w:t>
-      </w:r>
-      <w:r>
-        <w:t xml:space="preserve">Who are they? What do they already know? What are they</w:t>
+        <w:t xml:space="preserve">Values:</w:t>
+      </w:r>
+      <w:r>
+        <w:t xml:space="preserve"> </w:t>
+      </w:r>
+      <w:r>
+        <w:t xml:space="preserve">Two or three, one line each — your organization’s own.</w:t>
       </w:r>
       <w:r>
         <w:t xml:space="preserve"> </w:t>
@@ -144,13 +144,13 @@
           <w:b/>
           <w:bCs/>
         </w:rPr>
-        <w:t xml:space="preserve">not</w:t>
-      </w:r>
-      <w:r>
-        <w:t xml:space="preserve"> </w:t>
-      </w:r>
-      <w:r>
-        <w:t xml:space="preserve">expected to know?</w:t>
+        <w:t xml:space="preserve">This field is first on purpose:</w:t>
+      </w:r>
+      <w:r>
+        <w:t xml:space="preserve"> </w:t>
+      </w:r>
+      <w:r>
+        <w:t xml:space="preserve">everything below inherits it, and you map each value to a concrete feature in the MDD (Guide §4). Decide what the course should stand for before you decide who it’s for.</w:t>
       </w:r>
       <w:r>
         <w:t xml:space="preserve"> </w:t>
@@ -171,13 +171,13 @@
           <w:b/>
           <w:bCs/>
         </w:rPr>
-        <w:t xml:space="preserve">Objective:</w:t>
-      </w:r>
-      <w:r>
-        <w:t xml:space="preserve"> </w:t>
-      </w:r>
-      <w:r>
-        <w:t xml:space="preserve">What should they be able to</w:t>
+        <w:t xml:space="preserve">Audience:</w:t>
+      </w:r>
+      <w:r>
+        <w:t xml:space="preserve"> </w:t>
+      </w:r>
+      <w:r>
+        <w:t xml:space="preserve">Who are they? What do they already know? What are they</w:t>
       </w:r>
       <w:r>
         <w:t xml:space="preserve"> </w:t>
@@ -187,13 +187,13 @@
           <w:b/>
           <w:bCs/>
         </w:rPr>
-        <w:t xml:space="preserve">do</w:t>
-      </w:r>
-      <w:r>
-        <w:t xml:space="preserve"> </w:t>
-      </w:r>
-      <w:r>
-        <w:t xml:space="preserve">at the end? (Production over theory, for most workplace training.)</w:t>
+        <w:t xml:space="preserve">not</w:t>
+      </w:r>
+      <w:r>
+        <w:t xml:space="preserve"> </w:t>
+      </w:r>
+      <w:r>
+        <w:t xml:space="preserve">expected to know?</w:t>
       </w:r>
       <w:r>
         <w:t xml:space="preserve"> </w:t>
@@ -214,26 +214,29 @@
           <w:b/>
           <w:bCs/>
         </w:rPr>
-        <w:t xml:space="preserve">Depth:</w:t>
-      </w:r>
-      <w:r>
-        <w:t xml:space="preserve"> </w:t>
-      </w:r>
-      <w:r>
-        <w:t xml:space="preserve">How far down do you go? (See the depth rule, Guide §7 — stop where deeper wouldn’t help</w:t>
-      </w:r>
-      <w:r>
-        <w:t xml:space="preserve"> </w:t>
-      </w:r>
-      <w:r>
-        <w:rPr>
-          <w:i/>
-          <w:iCs/>
-        </w:rPr>
-        <w:t xml:space="preserve">them</w:t>
-      </w:r>
-      <w:r>
-        <w:t xml:space="preserve">.)</w:t>
+        <w:t xml:space="preserve">Objective:</w:t>
+      </w:r>
+      <w:r>
+        <w:t xml:space="preserve"> </w:t>
+      </w:r>
+      <w:r>
+        <w:t xml:space="preserve">What should they be able to</w:t>
+      </w:r>
+      <w:r>
+        <w:t xml:space="preserve"> </w:t>
+      </w:r>
+      <w:r>
+        <w:rPr>
+          <w:b/>
+          <w:bCs/>
+        </w:rPr>
+        <w:t xml:space="preserve">do</w:t>
+      </w:r>
+      <w:r>
+        <w:t xml:space="preserve"> </w:t>
+      </w:r>
+      <w:r>
+        <w:t xml:space="preserve">at the end? (Production over theory, for most workplace training.)</w:t>
       </w:r>
       <w:r>
         <w:t xml:space="preserve"> </w:t>
@@ -254,13 +257,26 @@
           <w:b/>
           <w:bCs/>
         </w:rPr>
-        <w:t xml:space="preserve">Scope — In:</w:t>
-      </w:r>
-      <w:r>
-        <w:t xml:space="preserve"> </w:t>
-      </w:r>
-      <w:r>
-        <w:t xml:space="preserve">What’s covered.</w:t>
+        <w:t xml:space="preserve">Depth:</w:t>
+      </w:r>
+      <w:r>
+        <w:t xml:space="preserve"> </w:t>
+      </w:r>
+      <w:r>
+        <w:t xml:space="preserve">How far down do you go? (See the depth rule, Guide §7 — stop where deeper wouldn’t help</w:t>
+      </w:r>
+      <w:r>
+        <w:t xml:space="preserve"> </w:t>
+      </w:r>
+      <w:r>
+        <w:rPr>
+          <w:i/>
+          <w:iCs/>
+        </w:rPr>
+        <w:t xml:space="preserve">them</w:t>
+      </w:r>
+      <w:r>
+        <w:t xml:space="preserve">.)</w:t>
       </w:r>
       <w:r>
         <w:t xml:space="preserve"> </w:t>
@@ -281,13 +297,13 @@
           <w:b/>
           <w:bCs/>
         </w:rPr>
-        <w:t xml:space="preserve">Scope — Out:</w:t>
-      </w:r>
-      <w:r>
-        <w:t xml:space="preserve"> </w:t>
-      </w:r>
-      <w:r>
-        <w:t xml:space="preserve">What’s explicitly excluded.</w:t>
+        <w:t xml:space="preserve">Scope — In:</w:t>
+      </w:r>
+      <w:r>
+        <w:t xml:space="preserve"> </w:t>
+      </w:r>
+      <w:r>
+        <w:t xml:space="preserve">What’s covered.</w:t>
       </w:r>
       <w:r>
         <w:t xml:space="preserve"> </w:t>
@@ -308,45 +324,13 @@
           <w:b/>
           <w:bCs/>
         </w:rPr>
-        <w:t xml:space="preserve">Tone &amp; how you give help:</w:t>
-      </w:r>
-      <w:r>
-        <w:t xml:space="preserve"> </w:t>
-      </w:r>
-      <w:r>
-        <w:t xml:space="preserve">How warm/formal? Your approach to</w:t>
-      </w:r>
-      <w:r>
-        <w:t xml:space="preserve"> </w:t>
-      </w:r>
-      <w:r>
-        <w:rPr>
-          <w:b/>
-          <w:bCs/>
-        </w:rPr>
-        <w:t xml:space="preserve">hints</w:t>
-      </w:r>
-      <w:r>
-        <w:t xml:space="preserve"> </w:t>
-      </w:r>
-      <w:r>
-        <w:t xml:space="preserve">— the guidance you leave for students</w:t>
-      </w:r>
-      <w:r>
-        <w:t xml:space="preserve"> </w:t>
-      </w:r>
-      <w:r>
-        <w:rPr>
-          <w:i/>
-          <w:iCs/>
-        </w:rPr>
-        <w:t xml:space="preserve">when you’re not in the room</w:t>
-      </w:r>
-      <w:r>
-        <w:t xml:space="preserve"> </w:t>
-      </w:r>
-      <w:r>
-        <w:t xml:space="preserve">(a reminder of purpose, never the answer).</w:t>
+        <w:t xml:space="preserve">Scope — Out:</w:t>
+      </w:r>
+      <w:r>
+        <w:t xml:space="preserve"> </w:t>
+      </w:r>
+      <w:r>
+        <w:t xml:space="preserve">What’s explicitly excluded.</w:t>
       </w:r>
       <w:r>
         <w:t xml:space="preserve"> </w:t>
@@ -367,13 +351,45 @@
           <w:b/>
           <w:bCs/>
         </w:rPr>
-        <w:t xml:space="preserve">Frameworks / tools / materials:</w:t>
-      </w:r>
-      <w:r>
-        <w:t xml:space="preserve"> </w:t>
-      </w:r>
-      <w:r>
-        <w:t xml:space="preserve">What will students use?</w:t>
+        <w:t xml:space="preserve">Tone &amp; how you give help:</w:t>
+      </w:r>
+      <w:r>
+        <w:t xml:space="preserve"> </w:t>
+      </w:r>
+      <w:r>
+        <w:t xml:space="preserve">How warm/formal? Your approach to</w:t>
+      </w:r>
+      <w:r>
+        <w:t xml:space="preserve"> </w:t>
+      </w:r>
+      <w:r>
+        <w:rPr>
+          <w:b/>
+          <w:bCs/>
+        </w:rPr>
+        <w:t xml:space="preserve">hints</w:t>
+      </w:r>
+      <w:r>
+        <w:t xml:space="preserve"> </w:t>
+      </w:r>
+      <w:r>
+        <w:t xml:space="preserve">— the guidance you leave for students</w:t>
+      </w:r>
+      <w:r>
+        <w:t xml:space="preserve"> </w:t>
+      </w:r>
+      <w:r>
+        <w:rPr>
+          <w:i/>
+          <w:iCs/>
+        </w:rPr>
+        <w:t xml:space="preserve">when you’re not in the room</w:t>
+      </w:r>
+      <w:r>
+        <w:t xml:space="preserve"> </w:t>
+      </w:r>
+      <w:r>
+        <w:t xml:space="preserve">(a reminder of purpose, never the answer).</w:t>
       </w:r>
       <w:r>
         <w:t xml:space="preserve"> </w:t>
@@ -394,13 +410,13 @@
           <w:b/>
           <w:bCs/>
         </w:rPr>
-        <w:t xml:space="preserve">Values:</w:t>
-      </w:r>
-      <w:r>
-        <w:t xml:space="preserve"> </w:t>
-      </w:r>
-      <w:r>
-        <w:t xml:space="preserve">Two or three, one line each — your organization’s own. (You map each to a concrete feature in the MDD, Guide §4.)</w:t>
+        <w:t xml:space="preserve">Frameworks / tools / materials:</w:t>
+      </w:r>
+      <w:r>
+        <w:t xml:space="preserve"> </w:t>
+      </w:r>
+      <w:r>
+        <w:t xml:space="preserve">What will students use?</w:t>
       </w:r>
       <w:r>
         <w:t xml:space="preserve"> </w:t>

</xml_diff>